<commit_message>
JEREZ anexo jornada: quitar campos "Turno asignado" y "Días y horario"
Se eliminan las líneas en blanco de turno asignado / días y horario del
anexo de jornada (a pedido). La cláusula SEGUNDO queda con las horas
semanales en blanco + la tabla de turnos referenciales.

Co-Authored-By: Claude Opus 4.8 <noreply@anthropic.com>
</commit_message>
<xml_diff>
--- a/app/plantillas/JEREZ 78269062-0/ANEXO Jornada Laboral (form manual).docx
+++ b/app/plantillas/JEREZ 78269062-0/ANEXO Jornada Laboral (form manual).docx
@@ -60,32 +60,7 @@
         <w:t xml:space="preserve">SEGUNDO. </w:t>
       </w:r>
       <w:r>
-        <w:t>La jornada ordinaria de trabajo será de ________ horas semanales, distribuida según el sistema de turnos rotativos y variables que el empleador publica semanalmente, con los descansos legales correspondientes. El turno asignado al trabajador es el siguiente:</w:t>
-      </w:r>
-    </w:p>
-    <w:p/>
-    <w:p>
-      <w:pPr>
-        <w:jc w:val="both"/>
-      </w:pPr>
-      <w:r>
-        <w:t>Turno asignado: ___________________________________________________________</w:t>
-      </w:r>
-    </w:p>
-    <w:p>
-      <w:pPr>
-        <w:jc w:val="both"/>
-      </w:pPr>
-      <w:r>
-        <w:t>Días y horario: ____________________________________________________________</w:t>
-      </w:r>
-    </w:p>
-    <w:p>
-      <w:pPr>
-        <w:jc w:val="both"/>
-      </w:pPr>
-      <w:r>
-        <w:t>___________________________________________________________________________</w:t>
+        <w:t>La jornada ordinaria de trabajo será de ________ horas semanales, distribuida según el sistema de turnos rotativos y variables que el empleador publica semanalmente, con los descansos legales correspondientes.</w:t>
       </w:r>
     </w:p>
     <w:p/>

</xml_diff>